<commit_message>
2nd reviews addressed first pass
</commit_message>
<xml_diff>
--- a/paper/submission_tables/Table3.docx
+++ b/paper/submission_tables/Table3.docx
@@ -27,13 +27,94 @@
         </m:r>
       </m:oMath>
       <w:r>
-        <w:t xml:space="preserve">: satisfied (by construction, or verified empirically for</w:t>
+        <w:t xml:space="preserve">: satisfied substantively (by construction, or verified</w:t>
       </w:r>
       <w:r>
         <w:t xml:space="preserve"> </w:t>
       </w:r>
       <w:r>
-        <w:t xml:space="preserve">the candidate).</w:t>
+        <w:t xml:space="preserve">empirically for the candidate).</w:t>
+      </w:r>
+      <w:r>
+        <w:t xml:space="preserve"> </w:t>
+      </w:r>
+      <m:oMath>
+        <m:r>
+          <m:rPr>
+            <m:sty m:val="p"/>
+          </m:rPr>
+          <m:t>(</m:t>
+        </m:r>
+        <m:r>
+          <m:rPr>
+            <m:sty m:val="p"/>
+          </m:rPr>
+          <m:t>✓</m:t>
+        </m:r>
+        <m:r>
+          <m:rPr>
+            <m:sty m:val="p"/>
+          </m:rPr>
+          <m:t>)</m:t>
+        </m:r>
+      </m:oMath>
+      <w:r>
+        <w:t xml:space="preserve">: satisfied only</w:t>
+      </w:r>
+      <w:r>
+        <w:t xml:space="preserve"> </w:t>
+      </w:r>
+      <w:r>
+        <w:t xml:space="preserve">vacuously, because the property’s antecedent is never triggered</w:t>
+      </w:r>
+      <w:r>
+        <w:t xml:space="preserve"> </w:t>
+      </w:r>
+      <w:r>
+        <w:t xml:space="preserve">(entropy’s and Gini’s D2, which score no</w:t>
+      </w:r>
+      <w:r>
+        <w:t xml:space="preserve"> </w:t>
+      </w:r>
+      <m:oMath>
+        <m:r>
+          <m:t>k</m:t>
+        </m:r>
+      </m:oMath>
+      <w:r>
+        <w:t xml:space="preserve">-th ranked affinity;</w:t>
+      </w:r>
+      <w:r>
+        <w:t xml:space="preserve"> </w:t>
+      </w:r>
+      <w:r>
+        <w:t xml:space="preserve">the ratio’s D3, which has no baseline</w:t>
+      </w:r>
+      <w:r>
+        <w:t xml:space="preserve"> </w:t>
+      </w:r>
+      <m:oMath>
+        <m:r>
+          <m:t>β</m:t>
+        </m:r>
+      </m:oMath>
+      <w:r>
+        <w:t xml:space="preserve"> </w:t>
+      </w:r>
+      <w:r>
+        <w:t xml:space="preserve">to be sensitive to),</w:t>
+      </w:r>
+      <w:r>
+        <w:t xml:space="preserve"> </w:t>
+      </w:r>
+      <w:r>
+        <w:t xml:space="preserve">not because the measure does the substantive work the property is</w:t>
+      </w:r>
+      <w:r>
+        <w:t xml:space="preserve"> </w:t>
+      </w:r>
+      <w:r>
+        <w:t xml:space="preserve">meant to verify.</w:t>
       </w:r>
       <w:r>
         <w:t xml:space="preserve"> </w:t>
@@ -73,13 +154,25 @@
         <w:t xml:space="preserve"> </w:t>
       </w:r>
       <w:r>
-        <w:t xml:space="preserve">The D1, D2 and D4 verdicts follow from the functional forms. The D3</w:t>
+        <w:t xml:space="preserve">The D1, D2 and D4 verdicts follow from the functional forms set out</w:t>
       </w:r>
       <w:r>
         <w:t xml:space="preserve"> </w:t>
       </w:r>
       <w:r>
-        <w:t xml:space="preserve">verdicts for the entropy and the Gini are empirical.</w:t>
+        <w:t xml:space="preserve">in Methods. The D3 verdicts follow from the interval-wide</w:t>
+      </w:r>
+      <w:r>
+        <w:t xml:space="preserve"> </w:t>
+      </w:r>
+      <w:r>
+        <w:t xml:space="preserve">definition of D3 (Methods), evaluated on the parameterized forms</w:t>
+      </w:r>
+      <w:r>
+        <w:t xml:space="preserve"> </w:t>
+      </w:r>
+      <w:r>
+        <w:t xml:space="preserve">implemented here.</w:t>
       </w:r>
     </w:p>
     <w:tbl>
@@ -87,7 +180,7 @@
         <w:tblStyle w:val="Table"/>
         <w:tblW w:type="auto" w:w="0"/>
         <w:tblLook w:firstRow="1" w:lastRow="0" w:firstColumn="0" w:lastColumn="0" w:noHBand="0" w:noVBand="0" w:val="0020"/>
-        <w:tblCaption w:val="Table 3. Satisfaction of the four motivated properties by existing selectivity definitions and by the candidate measure. \checkmark: satisfied (by construction, or verified empirically for the candidate). \sim: partially satisfied or satisfied under additional assumptions. \times: violated in general. The D1, D2 and D4 verdicts follow from the functional forms. The D3 verdicts for the entropy and the Gini are empirical."/>
+        <w:tblCaption w:val="Table 3. Satisfaction of the four motivated properties by existing selectivity definitions and by the candidate measure. \checkmark: satisfied substantively (by construction, or verified empirically for the candidate). (\checkmark): satisfied only vacuously, because the property’s antecedent is never triggered (entropy’s and Gini’s D2, which score no k-th ranked affinity; the ratio’s D3, which has no baseline \beta to be sensitive to), not because the measure does the substantive work the property is meant to verify. \sim: partially satisfied or satisfied under additional assumptions. \times: violated in general. The D1, D2 and D4 verdicts follow from the functional forms set out in Methods. The D3 verdicts follow from the interval-wide definition of D3 (Methods), evaluated on the parameterized forms implemented here."/>
       </w:tblPr>
       <w:tblGrid>
         <w:gridCol w:w="1320"/>
@@ -315,8 +408,20 @@
                 <m:rPr>
                   <m:sty m:val="p"/>
                 </m:rPr>
+                <m:t>(</m:t>
+              </m:r>
+              <m:r>
+                <m:rPr>
+                  <m:sty m:val="p"/>
+                </m:rPr>
                 <m:t>✓</m:t>
               </m:r>
+              <m:r>
+                <m:rPr>
+                  <m:sty m:val="p"/>
+                </m:rPr>
+                <m:t>)</m:t>
+              </m:r>
             </m:oMath>
           </w:p>
         </w:tc>
@@ -332,7 +437,19 @@
                 <m:rPr>
                   <m:sty m:val="p"/>
                 </m:rPr>
+                <m:t>(</m:t>
+              </m:r>
+              <m:r>
+                <m:rPr>
+                  <m:sty m:val="p"/>
+                </m:rPr>
                 <m:t>✓</m:t>
+              </m:r>
+              <m:r>
+                <m:rPr>
+                  <m:sty m:val="p"/>
+                </m:rPr>
+                <m:t>)</m:t>
               </m:r>
             </m:oMath>
           </w:p>
@@ -448,7 +565,19 @@
                 <m:rPr>
                   <m:sty m:val="p"/>
                 </m:rPr>
+                <m:t>(</m:t>
+              </m:r>
+              <m:r>
+                <m:rPr>
+                  <m:sty m:val="p"/>
+                </m:rPr>
                 <m:t>✓</m:t>
+              </m:r>
+              <m:r>
+                <m:rPr>
+                  <m:sty m:val="p"/>
+                </m:rPr>
+                <m:t>)</m:t>
               </m:r>
             </m:oMath>
           </w:p>

</xml_diff>